<commit_message>
docs: update diploma documentation files
</commit_message>
<xml_diff>
--- a/docs/diploma_lar.docx
+++ b/docs/diploma_lar.docx
@@ -145,6 +145,16 @@
       <w:pPr>
         <w:spacing w:after="40" w:line="360" w:lineRule="auto"/>
       </w:pPr>
+    </w:p>
+    <w:p>
+      <w:pPr>
+        <w:spacing w:after="40" w:line="360" w:lineRule="auto"/>
+      </w:pPr>
+    </w:p>
+    <w:p>
+      <w:pPr>
+        <w:spacing w:after="40" w:line="360" w:lineRule="auto"/>
+      </w:pPr>
       <w:r>
         <w:t>Дипломант:......................</w:t>
       </w:r>
@@ -206,6 +216,7 @@
           <w:sz w:val="28"/>
           <w:szCs w:val="28"/>
         </w:rPr>
+        <w:lastRenderedPageBreak/>
         <w:t>СЪДЪРЖАНИЕ</w:t>
       </w:r>
     </w:p>
@@ -341,7 +352,7 @@
                 <w:noProof/>
                 <w:webHidden/>
               </w:rPr>
-              <w:t>2</w:t>
+              <w:t>3</w:t>
             </w:r>
             <w:r>
               <w:rPr>
@@ -2595,6 +2606,7 @@
       </w:pPr>
       <w:bookmarkStart w:id="1" w:name="_Toc227048068"/>
       <w:r>
+        <w:lastRenderedPageBreak/>
         <w:t>1. Въведение</w:t>
       </w:r>
       <w:bookmarkEnd w:id="0"/>
@@ -2607,7 +2619,6 @@
         <w:jc w:val="both"/>
       </w:pPr>
       <w:r>
-        <w:lastRenderedPageBreak/>
         <w:t>Настоящият дипломен проект представя разработката на пълнофункционална уеб система за управление на луксозен автомобилен ризорт, наречена "Luxe Auto Resort". Системата е предназначена да автоматизира и оптимизира процесите по наемане на автомобили, управление на клиентски заявки и администриране на автопарк. Проектът обхваща цялостния жизнен цикъл на разработката – от анализ на изискванията и проектиране до реализация и тестване на функционален уеб продукт.</w:t>
       </w:r>
     </w:p>
@@ -6723,6 +6734,7 @@
           <w:sz w:val="26"/>
           <w:szCs w:val="26"/>
         </w:rPr>
+        <w:lastRenderedPageBreak/>
         <w:t>Таблица templates (Шаблони за наем)</w:t>
       </w:r>
     </w:p>

</xml_diff>